<commit_message>
docs: implantacao local em Docker, no mesmo stack do gpe2
O GPEDocs local passa a rodar nos containers do proprio compose (app-docs,
nginx-docs, queue-docs na porta 8090), na rede gpe_gpe e com o banco do
container db-gpe, como em producao. Comandos via docker exec; arquivos no
volume gpedocs_storage. Alerta sobre public/hot deixado por npm run dev,
que faz o navegador buscar o JavaScript num Vite parado.

Co-Authored-By: Claude Opus 5.5 <noreply@anthropic.com>
</commit_message>
<xml_diff>
--- a/docs/entrega/4 - Implantacao de municipio.docx
+++ b/docs/entrega/4 - Implantacao de municipio.docx
@@ -261,7 +261,7 @@
                 <w:sz w:val="19"/>
                 <w:szCs w:val="19"/>
               </w:rPr>
-              <w:t xml:space="preserve">Local (Laragon, porta 8090)</w:t>
+              <w:t xml:space="preserve">Local (Docker, porta 8090)</w:t>
             </w:r>
           </w:p>
         </w:tc>
@@ -324,7 +324,7 @@
                 <w:sz w:val="19"/>
                 <w:szCs w:val="19"/>
               </w:rPr>
-              <w:t xml:space="preserve">127.0.0.1</w:t>
+              <w:t xml:space="preserve">db-gpe</w:t>
             </w:r>
             <w:r>
               <w:rPr>
@@ -339,14 +339,14 @@
                 <w:sz w:val="19"/>
                 <w:szCs w:val="19"/>
               </w:rPr>
-              <w:t xml:space="preserve">5433</w:t>
-            </w:r>
-            <w:r>
-              <w:rPr>
-                <w:sz w:val="19"/>
-                <w:szCs w:val="19"/>
-              </w:rPr>
-              <w:t xml:space="preserve"> (container </w:t>
+              <w:t xml:space="preserve">5432</w:t>
+            </w:r>
+            <w:r>
+              <w:rPr>
+                <w:sz w:val="19"/>
+                <w:szCs w:val="19"/>
+              </w:rPr>
+              <w:t xml:space="preserve"> (container do gpe2, rede </w:t>
             </w:r>
             <w:r>
               <w:rPr>
@@ -354,7 +354,7 @@
                 <w:sz w:val="19"/>
                 <w:szCs w:val="19"/>
               </w:rPr>
-              <w:t xml:space="preserve">db-gpe</w:t>
+              <w:t xml:space="preserve">gpe_gpe</w:t>
             </w:r>
             <w:r>
               <w:rPr>
@@ -513,7 +513,7 @@
         <w:spacing w:after="120" w:before="280"/>
       </w:pPr>
       <w:r>
-        <w:t xml:space="preserve">Montar do zero (local)</w:t>
+        <w:t xml:space="preserve">Montar do zero (local, em Docker)</w:t>
       </w:r>
     </w:p>
     <w:p>
@@ -522,6 +522,70 @@
         <w:jc w:val="both"/>
       </w:pPr>
       <w:r>
+        <w:t xml:space="preserve">O GPEDocs roda no mesmo Docker do gpe2: o stack do GED (</w:t>
+      </w:r>
+      <w:r>
+        <w:rPr>
+          <w:rFonts w:ascii="Consolas" w:cs="Consolas" w:eastAsia="Consolas" w:hAnsi="Consolas"/>
+          <w:sz w:val="19"/>
+          <w:szCs w:val="19"/>
+        </w:rPr>
+        <w:t xml:space="preserve">app-docs</w:t>
+      </w:r>
+      <w:r>
+        <w:t xml:space="preserve">, </w:t>
+      </w:r>
+      <w:r>
+        <w:rPr>
+          <w:rFonts w:ascii="Consolas" w:cs="Consolas" w:eastAsia="Consolas" w:hAnsi="Consolas"/>
+          <w:sz w:val="19"/>
+          <w:szCs w:val="19"/>
+        </w:rPr>
+        <w:t xml:space="preserve">nginx-docs</w:t>
+      </w:r>
+      <w:r>
+        <w:t xml:space="preserve">, </w:t>
+      </w:r>
+      <w:r>
+        <w:rPr>
+          <w:rFonts w:ascii="Consolas" w:cs="Consolas" w:eastAsia="Consolas" w:hAnsi="Consolas"/>
+          <w:sz w:val="19"/>
+          <w:szCs w:val="19"/>
+        </w:rPr>
+        <w:t xml:space="preserve">queue-docs</w:t>
+      </w:r>
+      <w:r>
+        <w:t xml:space="preserve">) entra na rede </w:t>
+      </w:r>
+      <w:r>
+        <w:rPr>
+          <w:rFonts w:ascii="Consolas" w:cs="Consolas" w:eastAsia="Consolas" w:hAnsi="Consolas"/>
+          <w:sz w:val="19"/>
+          <w:szCs w:val="19"/>
+        </w:rPr>
+        <w:t xml:space="preserve">gpe_gpe</w:t>
+      </w:r>
+      <w:r>
+        <w:t xml:space="preserve"> e usa o banco do container </w:t>
+      </w:r>
+      <w:r>
+        <w:rPr>
+          <w:rFonts w:ascii="Consolas" w:cs="Consolas" w:eastAsia="Consolas" w:hAnsi="Consolas"/>
+          <w:sz w:val="19"/>
+          <w:szCs w:val="19"/>
+        </w:rPr>
+        <w:t xml:space="preserve">db-gpe</w:t>
+      </w:r>
+      <w:r>
+        <w:t xml:space="preserve">. O stack do gpe2 precisa estar no ar.</w:t>
+      </w:r>
+    </w:p>
+    <w:p>
+      <w:pPr>
+        <w:spacing w:after="120" w:line="276"/>
+        <w:jc w:val="both"/>
+      </w:pPr>
+      <w:r>
         <w:rPr>
           <w:rFonts w:ascii="Consolas" w:cs="Consolas" w:eastAsia="Consolas" w:hAnsi="Consolas"/>
           <w:sz w:val="19"/>
@@ -530,7 +594,7 @@
         <w:t xml:space="preserve">.env</w:t>
       </w:r>
       <w:r>
-        <w:t xml:space="preserve"> do GPEDocs (o original ficou em </w:t>
+        <w:t xml:space="preserve"> do GPEDocs (as versões anteriores ficaram em </w:t>
       </w:r>
       <w:r>
         <w:rPr>
@@ -539,6 +603,17 @@
           <w:szCs w:val="19"/>
         </w:rPr>
         <w:t xml:space="preserve">.env.bak-antes-docs-santoantonio</w:t>
+      </w:r>
+      <w:r>
+        <w:t xml:space="preserve"> e </w:t>
+      </w:r>
+      <w:r>
+        <w:rPr>
+          <w:rFonts w:ascii="Consolas" w:cs="Consolas" w:eastAsia="Consolas" w:hAnsi="Consolas"/>
+          <w:sz w:val="19"/>
+          <w:szCs w:val="19"/>
+        </w:rPr>
+        <w:t xml:space="preserve">.env.bak-antes-docker</w:t>
       </w:r>
       <w:r>
         <w:t xml:space="preserve">):</w:t>
@@ -556,7 +631,7 @@
           <w:sz w:val="18"/>
           <w:szCs w:val="18"/>
         </w:rPr>
-        <w:t xml:space="preserve">DB_HOST=127.0.0.1</w:t>
+        <w:t xml:space="preserve">APP_PORT=8090</w:t>
       </w:r>
     </w:p>
     <w:p>
@@ -571,7 +646,7 @@
           <w:sz w:val="18"/>
           <w:szCs w:val="18"/>
         </w:rPr>
-        <w:t xml:space="preserve">DB_PORT=5433</w:t>
+        <w:t xml:space="preserve">APP_URL=http://localhost:8090</w:t>
       </w:r>
     </w:p>
     <w:p>
@@ -586,7 +661,7 @@
           <w:sz w:val="18"/>
           <w:szCs w:val="18"/>
         </w:rPr>
-        <w:t xml:space="preserve">DB_DATABASE=docs_santoantoniodoamparo</w:t>
+        <w:t xml:space="preserve">DB_HOST=db-gpe</w:t>
       </w:r>
     </w:p>
     <w:p>
@@ -601,7 +676,7 @@
           <w:sz w:val="18"/>
           <w:szCs w:val="18"/>
         </w:rPr>
-        <w:t xml:space="preserve">LANDLORD_DB_DATABASE=gpe_registry</w:t>
+        <w:t xml:space="preserve">DB_PORT=5432</w:t>
       </w:r>
     </w:p>
     <w:p>
@@ -616,7 +691,7 @@
           <w:sz w:val="18"/>
           <w:szCs w:val="18"/>
         </w:rPr>
-        <w:t xml:space="preserve">TENANT_DOMINIO_BASE=:8090</w:t>
+        <w:t xml:space="preserve">DB_DATABASE=docs_santoantoniodoamparo</w:t>
       </w:r>
     </w:p>
     <w:p>
@@ -631,7 +706,7 @@
           <w:sz w:val="18"/>
           <w:szCs w:val="18"/>
         </w:rPr>
-        <w:t xml:space="preserve">APP_URL=http://localhost:8090</w:t>
+        <w:t xml:space="preserve">LANDLORD_DB_DATABASE=gpe_registry</w:t>
       </w:r>
     </w:p>
     <w:p>
@@ -646,7 +721,7 @@
           <w:sz w:val="18"/>
           <w:szCs w:val="18"/>
         </w:rPr>
-        <w:t xml:space="preserve"># origem da estrutura: banco do município no gpe2</w:t>
+        <w:t xml:space="preserve">TENANT_DOMINIO_BASE=:8090</w:t>
       </w:r>
     </w:p>
     <w:p>
@@ -661,7 +736,7 @@
           <w:sz w:val="18"/>
           <w:szCs w:val="18"/>
         </w:rPr>
-        <w:t xml:space="preserve">GPE_LEGADO_DRIVER=pgsql</w:t>
+        <w:t xml:space="preserve"># origem da estrutura: banco do município no gpe2</w:t>
       </w:r>
     </w:p>
     <w:p>
@@ -676,7 +751,7 @@
           <w:sz w:val="18"/>
           <w:szCs w:val="18"/>
         </w:rPr>
-        <w:t xml:space="preserve">GPE_LEGADO_HOST=127.0.0.1</w:t>
+        <w:t xml:space="preserve">GPE_LEGADO_DRIVER=pgsql</w:t>
       </w:r>
     </w:p>
     <w:p>
@@ -691,7 +766,7 @@
           <w:sz w:val="18"/>
           <w:szCs w:val="18"/>
         </w:rPr>
-        <w:t xml:space="preserve">GPE_LEGADO_PORT=5433</w:t>
+        <w:t xml:space="preserve">GPE_LEGADO_HOST=db-gpe</w:t>
       </w:r>
     </w:p>
     <w:p>
@@ -706,12 +781,58 @@
           <w:sz w:val="18"/>
           <w:szCs w:val="18"/>
         </w:rPr>
+        <w:t xml:space="preserve">GPE_LEGADO_PORT=5432</w:t>
+      </w:r>
+    </w:p>
+    <w:p>
+      <w:pPr>
+        <w:shd w:fill="F3F4F6" w:color="auto" w:val="clear"/>
+        <w:spacing w:after="0"/>
+        <w:ind w:left="240"/>
+      </w:pPr>
+      <w:r>
+        <w:rPr>
+          <w:rFonts w:ascii="Consolas" w:cs="Consolas" w:eastAsia="Consolas" w:hAnsi="Consolas"/>
+          <w:sz w:val="18"/>
+          <w:szCs w:val="18"/>
+        </w:rPr>
         <w:t xml:space="preserve">GPE_LEGADO_DATABASE=gpesantoantoniodoamparo</w:t>
       </w:r>
     </w:p>
     <w:p>
       <w:r>
         <w:t xml:space="preserve"/>
+      </w:r>
+    </w:p>
+    <w:p>
+      <w:pPr>
+        <w:spacing w:after="120" w:line="276"/>
+        <w:jc w:val="both"/>
+      </w:pPr>
+      <w:r>
+        <w:t xml:space="preserve">Não deixar </w:t>
+      </w:r>
+      <w:r>
+        <w:rPr>
+          <w:rFonts w:ascii="Consolas" w:cs="Consolas" w:eastAsia="Consolas" w:hAnsi="Consolas"/>
+          <w:sz w:val="19"/>
+          <w:szCs w:val="19"/>
+        </w:rPr>
+        <w:t xml:space="preserve">public/hot</w:t>
+      </w:r>
+      <w:r>
+        <w:t xml:space="preserve"> na pasta do projeto: ele faz o navegador buscar o JavaScript num servidor Vite (o container </w:t>
+      </w:r>
+      <w:r>
+        <w:rPr>
+          <w:rFonts w:ascii="Consolas" w:cs="Consolas" w:eastAsia="Consolas" w:hAnsi="Consolas"/>
+          <w:sz w:val="19"/>
+          <w:szCs w:val="19"/>
+        </w:rPr>
+        <w:t xml:space="preserve">vite</w:t>
+      </w:r>
+      <w:r>
+        <w:t xml:space="preserve"> só sobe se for pedido).</w:t>
       </w:r>
     </w:p>
     <w:p>
@@ -723,15 +844,18 @@
         <w:t xml:space="preserve">1. </w:t>
       </w:r>
       <w:r>
-        <w:t xml:space="preserve">Tabelas de fila do GPEDocs no catálogo (uma vez): </w:t>
-      </w:r>
-      <w:r>
-        <w:rPr>
-          <w:rFonts w:ascii="Consolas" w:cs="Consolas" w:eastAsia="Consolas" w:hAnsi="Consolas"/>
-          <w:sz w:val="19"/>
-          <w:szCs w:val="19"/>
-        </w:rPr>
-        <w:t xml:space="preserve">php artisan migrate --database=landlord --path=database/migrations/landlord --force</w:t>
+        <w:t xml:space="preserve">Subir: </w:t>
+      </w:r>
+      <w:r>
+        <w:rPr>
+          <w:rFonts w:ascii="Consolas" w:cs="Consolas" w:eastAsia="Consolas" w:hAnsi="Consolas"/>
+          <w:sz w:val="19"/>
+          <w:szCs w:val="19"/>
+        </w:rPr>
+        <w:t xml:space="preserve">docker compose up -d --build app nginx queue</w:t>
+      </w:r>
+      <w:r>
+        <w:t xml:space="preserve"> → http://localhost:8090</w:t>
       </w:r>
     </w:p>
     <w:p>
@@ -743,51 +867,15 @@
         <w:t xml:space="preserve">2. </w:t>
       </w:r>
       <w:r>
-        <w:t xml:space="preserve">Linha do tenant no </w:t>
-      </w:r>
-      <w:r>
-        <w:rPr>
-          <w:rFonts w:ascii="Consolas" w:cs="Consolas" w:eastAsia="Consolas" w:hAnsi="Consolas"/>
-          <w:sz w:val="19"/>
-          <w:szCs w:val="19"/>
-        </w:rPr>
-        <w:t xml:space="preserve">gpe_registry.tenants</w:t>
-      </w:r>
-      <w:r>
-        <w:t xml:space="preserve"> (subdomain/domain da tabela acima, </w:t>
-      </w:r>
-      <w:r>
-        <w:rPr>
-          <w:rFonts w:ascii="Consolas" w:cs="Consolas" w:eastAsia="Consolas" w:hAnsi="Consolas"/>
-          <w:sz w:val="19"/>
-          <w:szCs w:val="19"/>
-        </w:rPr>
-        <w:t xml:space="preserve">driver=pgsql</w:t>
-      </w:r>
-      <w:r>
-        <w:t xml:space="preserve">, </w:t>
-      </w:r>
-      <w:r>
-        <w:rPr>
-          <w:rFonts w:ascii="Consolas" w:cs="Consolas" w:eastAsia="Consolas" w:hAnsi="Consolas"/>
-          <w:sz w:val="19"/>
-          <w:szCs w:val="19"/>
-        </w:rPr>
-        <w:t xml:space="preserve">db_name=docs_santoantoniodoamparo</w:t>
-      </w:r>
-      <w:r>
-        <w:t xml:space="preserve">, </w:t>
-      </w:r>
-      <w:r>
-        <w:rPr>
-          <w:rFonts w:ascii="Consolas" w:cs="Consolas" w:eastAsia="Consolas" w:hAnsi="Consolas"/>
-          <w:sz w:val="19"/>
-          <w:szCs w:val="19"/>
-        </w:rPr>
-        <w:t xml:space="preserve">cnpj</w:t>
-      </w:r>
-      <w:r>
-        <w:t xml:space="preserve"> só dígitos).</w:t>
+        <w:t xml:space="preserve">Tabelas de fila do GPEDocs no catálogo (uma vez): </w:t>
+      </w:r>
+      <w:r>
+        <w:rPr>
+          <w:rFonts w:ascii="Consolas" w:cs="Consolas" w:eastAsia="Consolas" w:hAnsi="Consolas"/>
+          <w:sz w:val="19"/>
+          <w:szCs w:val="19"/>
+        </w:rPr>
+        <w:t xml:space="preserve">docker exec app-docs php artisan migrate --database=landlord --path=database/migrations/landlord --force</w:t>
       </w:r>
     </w:p>
     <w:p>
@@ -799,15 +887,39 @@
         <w:t xml:space="preserve">3. </w:t>
       </w:r>
       <w:r>
-        <w:t xml:space="preserve">Banco, schema, estrutura base e super admins do gpe2: </w:t>
-      </w:r>
-      <w:r>
-        <w:rPr>
-          <w:rFonts w:ascii="Consolas" w:cs="Consolas" w:eastAsia="Consolas" w:hAnsi="Consolas"/>
-          <w:sz w:val="19"/>
-          <w:szCs w:val="19"/>
-        </w:rPr>
-        <w:t xml:space="preserve">php artisan docs:template-restore --tenant=&lt;id&gt; --legado=gpesantoantoniodoamparo --force</w:t>
+        <w:t xml:space="preserve">Linha do tenant no </w:t>
+      </w:r>
+      <w:r>
+        <w:rPr>
+          <w:rFonts w:ascii="Consolas" w:cs="Consolas" w:eastAsia="Consolas" w:hAnsi="Consolas"/>
+          <w:sz w:val="19"/>
+          <w:szCs w:val="19"/>
+        </w:rPr>
+        <w:t xml:space="preserve">gpe_registry.tenants</w:t>
+      </w:r>
+      <w:r>
+        <w:t xml:space="preserve"> (subdomain/domain/db</w:t>
+      </w:r>
+      <w:r>
+        <w:rPr>
+          <w:i/>
+          <w:iCs/>
+        </w:rPr>
+        <w:t xml:space="preserve">host da tabela acima, `driver=pgsql`, `db</w:t>
+      </w:r>
+      <w:r>
+        <w:t xml:space="preserve">name=docs_santoantoniodoamparo</w:t>
+      </w:r>
+      <w:r>
+        <w:rPr>
+          <w:rFonts w:ascii="Consolas" w:cs="Consolas" w:eastAsia="Consolas" w:hAnsi="Consolas"/>
+          <w:sz w:val="19"/>
+          <w:szCs w:val="19"/>
+        </w:rPr>
+        <w:t xml:space="preserve">, </w:t>
+      </w:r>
+      <w:r>
+        <w:t xml:space="preserve">cnpj` só dígitos).</w:t>
       </w:r>
     </w:p>
     <w:p>
@@ -819,15 +931,15 @@
         <w:t xml:space="preserve">4. </w:t>
       </w:r>
       <w:r>
-        <w:t xml:space="preserve">Estrutura real (UGs, organograma, usuários ativos com a mesma senha do gpe2): </w:t>
-      </w:r>
-      <w:r>
-        <w:rPr>
-          <w:rFonts w:ascii="Consolas" w:cs="Consolas" w:eastAsia="Consolas" w:hAnsi="Consolas"/>
-          <w:sz w:val="19"/>
-          <w:szCs w:val="19"/>
-        </w:rPr>
-        <w:t xml:space="preserve">php artisan docs:importar-estrutura --tenant=&lt;id&gt; --legado=gpesantoantoniodoamparo</w:t>
+        <w:t xml:space="preserve">Banco, schema, estrutura base e super admins do gpe2: </w:t>
+      </w:r>
+      <w:r>
+        <w:rPr>
+          <w:rFonts w:ascii="Consolas" w:cs="Consolas" w:eastAsia="Consolas" w:hAnsi="Consolas"/>
+          <w:sz w:val="19"/>
+          <w:szCs w:val="19"/>
+        </w:rPr>
+        <w:t xml:space="preserve">docker exec app-docs php artisan docs:template-restore --tenant=&lt;id&gt; --legado=gpesantoantoniodoamparo --force</w:t>
       </w:r>
     </w:p>
     <w:p>
@@ -839,15 +951,15 @@
         <w:t xml:space="preserve">5. </w:t>
       </w:r>
       <w:r>
-        <w:t xml:space="preserve">Conteúdo de demonstração (opcional — só em banco recém-criado): </w:t>
-      </w:r>
-      <w:r>
-        <w:rPr>
-          <w:rFonts w:ascii="Consolas" w:cs="Consolas" w:eastAsia="Consolas" w:hAnsi="Consolas"/>
-          <w:sz w:val="19"/>
-          <w:szCs w:val="19"/>
-        </w:rPr>
-        <w:t xml:space="preserve">php artisan docs:demonstracao --tenant=&lt;id&gt; --ug=UG-002</w:t>
+        <w:t xml:space="preserve">Estrutura real (UGs, organograma, usuários ativos com a mesma senha do gpe2): </w:t>
+      </w:r>
+      <w:r>
+        <w:rPr>
+          <w:rFonts w:ascii="Consolas" w:cs="Consolas" w:eastAsia="Consolas" w:hAnsi="Consolas"/>
+          <w:sz w:val="19"/>
+          <w:szCs w:val="19"/>
+        </w:rPr>
+        <w:t xml:space="preserve">docker exec app-docs php artisan docs:importar-estrutura --tenant=&lt;id&gt; --legado=gpesantoantoniodoamparo</w:t>
       </w:r>
     </w:p>
     <w:p>
@@ -859,18 +971,15 @@
         <w:t xml:space="preserve">6. </w:t>
       </w:r>
       <w:r>
-        <w:t xml:space="preserve">Subir: </w:t>
-      </w:r>
-      <w:r>
-        <w:rPr>
-          <w:rFonts w:ascii="Consolas" w:cs="Consolas" w:eastAsia="Consolas" w:hAnsi="Consolas"/>
-          <w:sz w:val="19"/>
-          <w:szCs w:val="19"/>
-        </w:rPr>
-        <w:t xml:space="preserve">php artisan serve --port=8090</w:t>
-      </w:r>
-      <w:r>
-        <w:t xml:space="preserve"> → http://localhost:8090</w:t>
+        <w:t xml:space="preserve">Conteúdo de demonstração (opcional — só em banco recém-criado): </w:t>
+      </w:r>
+      <w:r>
+        <w:rPr>
+          <w:rFonts w:ascii="Consolas" w:cs="Consolas" w:eastAsia="Consolas" w:hAnsi="Consolas"/>
+          <w:sz w:val="19"/>
+          <w:szCs w:val="19"/>
+        </w:rPr>
+        <w:t xml:space="preserve">docker exec app-docs php artisan docs:demonstracao --tenant=&lt;id&gt; --ug=UG-002</w:t>
       </w:r>
     </w:p>
     <w:p>
@@ -879,18 +988,40 @@
         <w:jc w:val="both"/>
       </w:pPr>
       <w:r>
-        <w:t xml:space="preserve">Refazer tudo: apagar </w:t>
-      </w:r>
-      <w:r>
-        <w:rPr>
-          <w:rFonts w:ascii="Consolas" w:cs="Consolas" w:eastAsia="Consolas" w:hAnsi="Consolas"/>
-          <w:sz w:val="19"/>
-          <w:szCs w:val="19"/>
-        </w:rPr>
-        <w:t xml:space="preserve">storage/app/private/tenants/docs_santoantoniodoamparo</w:t>
-      </w:r>
-      <w:r>
-        <w:t xml:space="preserve"> (o template-restore recria o banco, mas não limpa os arquivos) e repetir 3 a 5.</w:t>
+        <w:t xml:space="preserve">Os arquivos ficam no volume Docker </w:t>
+      </w:r>
+      <w:r>
+        <w:rPr>
+          <w:rFonts w:ascii="Consolas" w:cs="Consolas" w:eastAsia="Consolas" w:hAnsi="Consolas"/>
+          <w:sz w:val="19"/>
+          <w:szCs w:val="19"/>
+        </w:rPr>
+        <w:t xml:space="preserve">gpedocs_storage</w:t>
+      </w:r>
+      <w:r>
+        <w:t xml:space="preserve">, em </w:t>
+      </w:r>
+      <w:r>
+        <w:rPr>
+          <w:rFonts w:ascii="Consolas" w:cs="Consolas" w:eastAsia="Consolas" w:hAnsi="Consolas"/>
+          <w:sz w:val="19"/>
+          <w:szCs w:val="19"/>
+        </w:rPr>
+        <w:t xml:space="preserve">/var/www/html/storage/app/private/tenants/&lt;db_name&gt;</w:t>
+      </w:r>
+      <w:r>
+        <w:t xml:space="preserve"> dentro do container. Refazer tudo: </w:t>
+      </w:r>
+      <w:r>
+        <w:rPr>
+          <w:rFonts w:ascii="Consolas" w:cs="Consolas" w:eastAsia="Consolas" w:hAnsi="Consolas"/>
+          <w:sz w:val="19"/>
+          <w:szCs w:val="19"/>
+        </w:rPr>
+        <w:t xml:space="preserve">docker exec app-docs rm -rf storage/app/private/tenants/docs_santoantoniodoamparo</w:t>
+      </w:r>
+      <w:r>
+        <w:t xml:space="preserve"> (o template-restore recria o banco, mas não limpa os arquivos) e repetir 4 a 6.</w:t>
       </w:r>
     </w:p>
     <w:p>
@@ -1510,7 +1641,40 @@
         <w:t xml:space="preserve">storage/app/private</w:t>
       </w:r>
       <w:r>
-        <w:t xml:space="preserve">).</w:t>
+        <w:t xml:space="preserve">). Em Docker: </w:t>
+      </w:r>
+      <w:r>
+        <w:rPr>
+          <w:rFonts w:ascii="Consolas" w:cs="Consolas" w:eastAsia="Consolas" w:hAnsi="Consolas"/>
+          <w:sz w:val="19"/>
+          <w:szCs w:val="19"/>
+        </w:rPr>
+        <w:t xml:space="preserve">docker cp</w:t>
+      </w:r>
+      <w:r>
+        <w:t xml:space="preserve"> para dentro do container </w:t>
+      </w:r>
+      <w:r>
+        <w:rPr>
+          <w:rFonts w:ascii="Consolas" w:cs="Consolas" w:eastAsia="Consolas" w:hAnsi="Consolas"/>
+          <w:sz w:val="19"/>
+          <w:szCs w:val="19"/>
+        </w:rPr>
+        <w:t xml:space="preserve">app-docs</w:t>
+      </w:r>
+      <w:r>
+        <w:t xml:space="preserve"> e </w:t>
+      </w:r>
+      <w:r>
+        <w:rPr>
+          <w:rFonts w:ascii="Consolas" w:cs="Consolas" w:eastAsia="Consolas" w:hAnsi="Consolas"/>
+          <w:sz w:val="19"/>
+          <w:szCs w:val="19"/>
+        </w:rPr>
+        <w:t xml:space="preserve">chown -R www-data:www-data</w:t>
+      </w:r>
+      <w:r>
+        <w:t xml:space="preserve"> na pasta.</w:t>
       </w:r>
     </w:p>
     <w:p>

</xml_diff>

<commit_message>
fix(docker): nginx serve o mesmo public/ que o app (CSS dava 404)
O app le o manifest de public/build da pasta do projeto (bind ./public),
mas o nginx servia a copia de public/ embutida na imagem, compilada em
outro momento: os nomes com hash divergiam e o CSS respondia 404 (tela
sem estilo). O nginx passa a montar ./public em somente leitura, igual
ao servidor de homologacao, onde o front e compilado na pasta do projeto.

Co-Authored-By: Claude Opus 5.5 <noreply@anthropic.com>
</commit_message>
<xml_diff>
--- a/docs/entrega/4 - Implantacao de municipio.docx
+++ b/docs/entrega/4 - Implantacao de municipio.docx
@@ -833,6 +833,37 @@
       </w:r>
       <w:r>
         <w:t xml:space="preserve"> só sobe se for pedido).</w:t>
+      </w:r>
+    </w:p>
+    <w:p>
+      <w:pPr>
+        <w:spacing w:after="120" w:line="276"/>
+        <w:jc w:val="both"/>
+      </w:pPr>
+      <w:r>
+        <w:t xml:space="preserve">Telas (JSX/CSS): o app e o nginx leem o </w:t>
+      </w:r>
+      <w:r>
+        <w:rPr>
+          <w:rFonts w:ascii="Consolas" w:cs="Consolas" w:eastAsia="Consolas" w:hAnsi="Consolas"/>
+          <w:sz w:val="19"/>
+          <w:szCs w:val="19"/>
+        </w:rPr>
+        <w:t xml:space="preserve">public/build</w:t>
+      </w:r>
+      <w:r>
+        <w:t xml:space="preserve"> da pasta do projeto, como no servidor. Depois de alterar o front, rodar </w:t>
+      </w:r>
+      <w:r>
+        <w:rPr>
+          <w:rFonts w:ascii="Consolas" w:cs="Consolas" w:eastAsia="Consolas" w:hAnsi="Consolas"/>
+          <w:sz w:val="19"/>
+          <w:szCs w:val="19"/>
+        </w:rPr>
+        <w:t xml:space="preserve">npm run build</w:t>
+      </w:r>
+      <w:r>
+        <w:t xml:space="preserve"> no host — não é preciso reconstruir a imagem.</w:t>
       </w:r>
     </w:p>
     <w:p>

</xml_diff>